<commit_message>
ansible - loops updated
</commit_message>
<xml_diff>
--- a/Ansible/10-loops.docx
+++ b/Ansible/10-loops.docx
@@ -2043,6 +2043,7 @@
     </w:p>
     <w:p>
       <w:pPr>
+        <w:spacing w:after="100"/>
         <w:jc w:val="both"/>
         <w:rPr>
           <w:rFonts w:asciiTheme="majorBidi" w:hAnsiTheme="majorBidi" w:cstheme="majorBidi"/>
@@ -8357,6 +8358,8 @@
       <w:r>
         <w:rPr>
           <w:rFonts w:asciiTheme="majorBidi" w:hAnsiTheme="majorBidi" w:cstheme="majorBidi"/>
+          <w:b/>
+          <w:bCs/>
           <w:i/>
           <w:iCs/>
           <w:sz w:val="28"/>
@@ -16823,23 +16826,13 @@
         </w:rPr>
         <w:t xml:space="preserve">. </w:t>
       </w:r>
-      <w:proofErr w:type="gramStart"/>
-      <w:r>
-        <w:rPr>
-          <w:rFonts w:asciiTheme="majorBidi" w:hAnsiTheme="majorBidi" w:cstheme="majorBidi"/>
-          <w:sz w:val="28"/>
-          <w:szCs w:val="28"/>
-        </w:rPr>
-        <w:t>The</w:t>
-      </w:r>
-      <w:proofErr w:type="gramEnd"/>
-      <w:r>
-        <w:rPr>
-          <w:rFonts w:asciiTheme="majorBidi" w:hAnsiTheme="majorBidi" w:cstheme="majorBidi"/>
-          <w:sz w:val="28"/>
-          <w:szCs w:val="28"/>
-        </w:rPr>
-        <w:t xml:space="preserve"> Filter generates the new Tuple:</w:t>
+      <w:r>
+        <w:rPr>
+          <w:rFonts w:asciiTheme="majorBidi" w:hAnsiTheme="majorBidi" w:cstheme="majorBidi"/>
+          <w:sz w:val="28"/>
+          <w:szCs w:val="28"/>
+        </w:rPr>
+        <w:t>The Filter generates the new Tuple:</w:t>
       </w:r>
     </w:p>
     <w:p>

</xml_diff>